<commit_message>
Raport si Credentials actualizate cu backend-ul
</commit_message>
<xml_diff>
--- a/raport.docx
+++ b/raport.docx
@@ -1694,7 +1694,7 @@
         <w:spacing w:after="120"/>
       </w:pPr>
       <w:r>
-        <w:t xml:space="preserve">Parolele utilizatorilor aplicației nu se păstrează în clar: în tabelul Utilizatori se salvează doar valoarea obținută prin funcția de hash, calculată peste numele de utilizator și parolă.</w:t>
+        <w:t xml:space="preserve">Parolele utilizatorilor aplicației nu se păstrează în clar. Aplicația salvează în tabelul Utilizatori doar hash-ul PBKDF2-SHA256, cu sare aleatorie și 210 000 de iterații. Conturile create de scriptul de date de test au inițial un hash SHA2_512, calculat peste numele de utilizator și parolă; aplicația îl acceptă și îl înlocuiește automat cu formatul PBKDF2 la prima autentificare reușită.</w:t>
       </w:r>
     </w:p>
     <w:p>
@@ -3138,11 +3138,10 @@
           <w:p>
             <w:r>
               <w:rPr>
-                <w:rFonts w:ascii="Consolas" w:cs="Consolas" w:eastAsia="Consolas" w:hAnsi="Consolas"/>
-                <w:b w:val="false"/>
-                <w:bCs w:val="false"/>
-                <w:sz w:val="19"/>
-                <w:szCs w:val="19"/>
+                <w:b w:val="false"/>
+                <w:bCs w:val="false"/>
+                <w:sz w:val="20"/>
+                <w:szCs w:val="20"/>
               </w:rPr>
               <w:t xml:space="preserve">interfața aplicației</w:t>
             </w:r>
@@ -3185,11 +3184,10 @@
           <w:p>
             <w:r>
               <w:rPr>
-                <w:rFonts w:ascii="Consolas" w:cs="Consolas" w:eastAsia="Consolas" w:hAnsi="Consolas"/>
-                <w:b w:val="false"/>
-                <w:bCs w:val="false"/>
-                <w:sz w:val="19"/>
-                <w:szCs w:val="19"/>
+                <w:b w:val="false"/>
+                <w:bCs w:val="false"/>
+                <w:sz w:val="20"/>
+                <w:szCs w:val="20"/>
               </w:rPr>
               <w:t xml:space="preserve">teste unitare</w:t>
             </w:r>
@@ -3286,6 +3284,19 @@
     </w:p>
     <w:p>
       <w:pPr>
+        <w:pStyle w:val="ListParagraph"/>
+        <w:numPr>
+          <w:ilvl w:val="0"/>
+          <w:numId w:val="2"/>
+        </w:numPr>
+        <w:spacing w:after="60"/>
+      </w:pPr>
+      <w:r>
+        <w:t xml:space="preserve">citirea și scrierea fișierelor autobuz_{AutobuzID}.json și harta.json, cu validarea structurii înainte de scriere și după citire: numărul de locuri egal cu capacitatea autobuzului, locuri numerotate continuu de la 1, fiecare loc pe o poziție proprie în grilă, conexiuni doar între noduri existente.</w:t>
+      </w:r>
+    </w:p>
+    <w:p>
+      <w:pPr>
         <w:spacing w:after="80"/>
       </w:pPr>
     </w:p>
@@ -3299,7 +3310,715 @@
     </w:p>
     <w:p>
       <w:pPr>
+        <w:pStyle w:val="Heading2"/>
+        <w:spacing w:after="100" w:before="220"/>
+      </w:pPr>
+      <w:r>
+        <w:t xml:space="preserve">Autogara.DataAccess</w:t>
+      </w:r>
+    </w:p>
+    <w:p>
+      <w:pPr>
+        <w:spacing w:after="120"/>
+      </w:pPr>
+      <w:r>
+        <w:t xml:space="preserve">Accesul la baza de date se face prin Entity Framework Core. Contextul mapează toate cele 17 tabele și 5 views din schema autogara, cu statusurile păstrate exact ca în constrângerile CHECK. Rezervarea, vânzarea, anularea, crearea locurilor, rapoartele și administrarea conturilor apelează procedurile stocate, cu parametri de ieșire, ca logica tranzacțională să rămână cea din baza de date.</w:t>
+      </w:r>
+    </w:p>
+    <w:p>
+      <w:pPr>
+        <w:pStyle w:val="ListParagraph"/>
+        <w:numPr>
+          <w:ilvl w:val="0"/>
+          <w:numId w:val="2"/>
+        </w:numPr>
+        <w:spacing w:after="60"/>
+      </w:pPr>
+      <w:r>
+        <w:t xml:space="preserve">reîncercare automată la erorile tranzitorii de rețea, importantă pentru conexiunea prin internet;</w:t>
+      </w:r>
+    </w:p>
+    <w:p>
+      <w:pPr>
+        <w:pStyle w:val="ListParagraph"/>
+        <w:numPr>
+          <w:ilvl w:val="0"/>
+          <w:numId w:val="2"/>
+        </w:numPr>
+        <w:spacing w:after="60"/>
+      </w:pPr>
+      <w:r>
+        <w:t xml:space="preserve">operațiile compuse rulează într-o singură tranzacție — de exemplu, anularea unei curse rambursează toate biletele ei sau nu modifică nimic;</w:t>
+      </w:r>
+    </w:p>
+    <w:p>
+      <w:pPr>
+        <w:pStyle w:val="ListParagraph"/>
+        <w:numPr>
+          <w:ilvl w:val="0"/>
+          <w:numId w:val="2"/>
+        </w:numPr>
+        <w:spacing w:after="60"/>
+      </w:pPr>
+      <w:r>
+        <w:t xml:space="preserve">erorile SQL se traduc în mesaje pentru utilizator: mesajele din procedurile stocate se afișează ca atare, iar pierderea conexiunii și modificările concurente (ROWVERSION) au mesaje proprii.</w:t>
+      </w:r>
+    </w:p>
+    <w:p>
+      <w:pPr>
+        <w:spacing w:after="60"/>
+      </w:pPr>
+    </w:p>
+    <w:p>
+      <w:pPr>
+        <w:pStyle w:val="Heading2"/>
+        <w:spacing w:after="100" w:before="220"/>
+      </w:pPr>
+      <w:r>
+        <w:t xml:space="preserve">Autogara.Business</w:t>
+      </w:r>
+    </w:p>
+    <w:p>
+      <w:pPr>
+        <w:spacing w:after="120"/>
+      </w:pPr>
+      <w:r>
+        <w:t xml:space="preserve">Serviciile de business conțin toată logica aplicației și sunt reunite într-o singură clasă, AutogaraBackend, pe care formularele o folosesc direct. Fiecare serviciu verifică rolul utilizatorului autentificat înainte de operație, nu doar interfața.</w:t>
+      </w:r>
+    </w:p>
+    <w:tbl>
+      <w:tblPr>
+        <w:tblW w:type="dxa" w:w="9638"/>
+        <w:tblBorders>
+          <w:top w:val="single" w:color="auto" w:sz="4"/>
+          <w:left w:val="single" w:color="auto" w:sz="4"/>
+          <w:bottom w:val="single" w:color="auto" w:sz="4"/>
+          <w:right w:val="single" w:color="auto" w:sz="4"/>
+          <w:insideH w:val="single" w:color="auto" w:sz="4"/>
+          <w:insideV w:val="single" w:color="auto" w:sz="4"/>
+        </w:tblBorders>
+      </w:tblPr>
+      <w:tblGrid>
+        <w:gridCol w:w="3000"/>
+        <w:gridCol w:w="6638"/>
+      </w:tblGrid>
+      <w:tr>
+        <w:trPr>
+          <w:tblHeader/>
+        </w:trPr>
+        <w:tc>
+          <w:tcPr>
+            <w:tcW w:type="dxa" w:w="3000"/>
+            <w:shd w:fill="F2F2F2" w:color="auto" w:val="clear"/>
+            <w:tcMar>
+              <w:top w:type="dxa" w:w="60"/>
+              <w:left w:type="dxa" w:w="110"/>
+              <w:bottom w:type="dxa" w:w="60"/>
+              <w:right w:type="dxa" w:w="110"/>
+            </w:tcMar>
+          </w:tcPr>
+          <w:p>
+            <w:r>
+              <w:rPr>
+                <w:b/>
+                <w:bCs/>
+                <w:sz w:val="20"/>
+                <w:szCs w:val="20"/>
+              </w:rPr>
+              <w:t xml:space="preserve">Serviciu</w:t>
+            </w:r>
+          </w:p>
+        </w:tc>
+        <w:tc>
+          <w:tcPr>
+            <w:tcW w:type="dxa" w:w="6638"/>
+            <w:shd w:fill="F2F2F2" w:color="auto" w:val="clear"/>
+            <w:tcMar>
+              <w:top w:type="dxa" w:w="60"/>
+              <w:left w:type="dxa" w:w="110"/>
+              <w:bottom w:type="dxa" w:w="60"/>
+              <w:right w:type="dxa" w:w="110"/>
+            </w:tcMar>
+          </w:tcPr>
+          <w:p>
+            <w:r>
+              <w:rPr>
+                <w:b/>
+                <w:bCs/>
+                <w:sz w:val="20"/>
+                <w:szCs w:val="20"/>
+              </w:rPr>
+              <w:t xml:space="preserve">Ce face</w:t>
+            </w:r>
+          </w:p>
+        </w:tc>
+      </w:tr>
+      <w:tr>
+        <w:tc>
+          <w:tcPr>
+            <w:tcW w:type="dxa" w:w="3000"/>
+            <w:tcMar>
+              <w:top w:type="dxa" w:w="60"/>
+              <w:left w:type="dxa" w:w="110"/>
+              <w:bottom w:type="dxa" w:w="60"/>
+              <w:right w:type="dxa" w:w="110"/>
+            </w:tcMar>
+          </w:tcPr>
+          <w:p>
+            <w:r>
+              <w:rPr>
+                <w:b w:val="false"/>
+                <w:bCs w:val="false"/>
+                <w:sz w:val="20"/>
+                <w:szCs w:val="20"/>
+              </w:rPr>
+              <w:t xml:space="preserve">Autentificare</w:t>
+            </w:r>
+          </w:p>
+        </w:tc>
+        <w:tc>
+          <w:tcPr>
+            <w:tcW w:type="dxa" w:w="6638"/>
+            <w:tcMar>
+              <w:top w:type="dxa" w:w="60"/>
+              <w:left w:type="dxa" w:w="110"/>
+              <w:bottom w:type="dxa" w:w="60"/>
+              <w:right w:type="dxa" w:w="110"/>
+            </w:tcMar>
+          </w:tcPr>
+          <w:p>
+            <w:r>
+              <w:rPr>
+                <w:b w:val="false"/>
+                <w:bCs w:val="false"/>
+                <w:sz w:val="20"/>
+                <w:szCs w:val="20"/>
+              </w:rPr>
+              <w:t xml:space="preserve">login, deconectare, schimbarea parolei, cererea de resetare și parola temporară dată de administrator</w:t>
+            </w:r>
+          </w:p>
+        </w:tc>
+      </w:tr>
+      <w:tr>
+        <w:tc>
+          <w:tcPr>
+            <w:tcW w:type="dxa" w:w="3000"/>
+            <w:tcMar>
+              <w:top w:type="dxa" w:w="60"/>
+              <w:left w:type="dxa" w:w="110"/>
+              <w:bottom w:type="dxa" w:w="60"/>
+              <w:right w:type="dxa" w:w="110"/>
+            </w:tcMar>
+          </w:tcPr>
+          <w:p>
+            <w:r>
+              <w:rPr>
+                <w:b w:val="false"/>
+                <w:bCs w:val="false"/>
+                <w:sz w:val="20"/>
+                <w:szCs w:val="20"/>
+              </w:rPr>
+              <w:t xml:space="preserve">Utilizatori</w:t>
+            </w:r>
+          </w:p>
+        </w:tc>
+        <w:tc>
+          <w:tcPr>
+            <w:tcW w:type="dxa" w:w="6638"/>
+            <w:tcMar>
+              <w:top w:type="dxa" w:w="60"/>
+              <w:left w:type="dxa" w:w="110"/>
+              <w:bottom w:type="dxa" w:w="60"/>
+              <w:right w:type="dxa" w:w="110"/>
+            </w:tcMar>
+          </w:tcPr>
+          <w:p>
+            <w:r>
+              <w:rPr>
+                <w:b w:val="false"/>
+                <w:bCs w:val="false"/>
+                <w:sz w:val="20"/>
+                <w:szCs w:val="20"/>
+              </w:rPr>
+              <w:t xml:space="preserve">adăugare, modificare, dezactivare și reactivare; rămâne mereu cel puțin un administrator activ</w:t>
+            </w:r>
+          </w:p>
+        </w:tc>
+      </w:tr>
+      <w:tr>
+        <w:tc>
+          <w:tcPr>
+            <w:tcW w:type="dxa" w:w="3000"/>
+            <w:tcMar>
+              <w:top w:type="dxa" w:w="60"/>
+              <w:left w:type="dxa" w:w="110"/>
+              <w:bottom w:type="dxa" w:w="60"/>
+              <w:right w:type="dxa" w:w="110"/>
+            </w:tcMar>
+          </w:tcPr>
+          <w:p>
+            <w:r>
+              <w:rPr>
+                <w:b w:val="false"/>
+                <w:bCs w:val="false"/>
+                <w:sz w:val="20"/>
+                <w:szCs w:val="20"/>
+              </w:rPr>
+              <w:t xml:space="preserve">Hartă</w:t>
+            </w:r>
+          </w:p>
+        </w:tc>
+        <w:tc>
+          <w:tcPr>
+            <w:tcW w:type="dxa" w:w="6638"/>
+            <w:tcMar>
+              <w:top w:type="dxa" w:w="60"/>
+              <w:left w:type="dxa" w:w="110"/>
+              <w:bottom w:type="dxa" w:w="60"/>
+              <w:right w:type="dxa" w:w="110"/>
+            </w:tcMar>
+          </w:tcPr>
+          <w:p>
+            <w:r>
+              <w:rPr>
+                <w:b w:val="false"/>
+                <w:bCs w:val="false"/>
+                <w:sz w:val="20"/>
+                <w:szCs w:val="20"/>
+              </w:rPr>
+              <w:t xml:space="preserve">încărcarea și salvarea nodurilor și conexiunilor, rescrierea harta.json, cel mai scurt drum între stații</w:t>
+            </w:r>
+          </w:p>
+        </w:tc>
+      </w:tr>
+      <w:tr>
+        <w:tc>
+          <w:tcPr>
+            <w:tcW w:type="dxa" w:w="3000"/>
+            <w:tcMar>
+              <w:top w:type="dxa" w:w="60"/>
+              <w:left w:type="dxa" w:w="110"/>
+              <w:bottom w:type="dxa" w:w="60"/>
+              <w:right w:type="dxa" w:w="110"/>
+            </w:tcMar>
+          </w:tcPr>
+          <w:p>
+            <w:r>
+              <w:rPr>
+                <w:b w:val="false"/>
+                <w:bCs w:val="false"/>
+                <w:sz w:val="20"/>
+                <w:szCs w:val="20"/>
+              </w:rPr>
+              <w:t xml:space="preserve">Stații și trasee</w:t>
+            </w:r>
+          </w:p>
+        </w:tc>
+        <w:tc>
+          <w:tcPr>
+            <w:tcW w:type="dxa" w:w="6638"/>
+            <w:tcMar>
+              <w:top w:type="dxa" w:w="60"/>
+              <w:left w:type="dxa" w:w="110"/>
+              <w:bottom w:type="dxa" w:w="60"/>
+              <w:right w:type="dxa" w:w="110"/>
+            </w:tcMar>
+          </w:tcPr>
+          <w:p>
+            <w:r>
+              <w:rPr>
+                <w:b w:val="false"/>
+                <w:bCs w:val="false"/>
+                <w:sz w:val="20"/>
+                <w:szCs w:val="20"/>
+              </w:rPr>
+              <w:t xml:space="preserve">adresa și peronul stațiilor; trasee cu opriri ordonate, verificate pe hartă, cu distanța totală</w:t>
+            </w:r>
+          </w:p>
+        </w:tc>
+      </w:tr>
+      <w:tr>
+        <w:tc>
+          <w:tcPr>
+            <w:tcW w:type="dxa" w:w="3000"/>
+            <w:tcMar>
+              <w:top w:type="dxa" w:w="60"/>
+              <w:left w:type="dxa" w:w="110"/>
+              <w:bottom w:type="dxa" w:w="60"/>
+              <w:right w:type="dxa" w:w="110"/>
+            </w:tcMar>
+          </w:tcPr>
+          <w:p>
+            <w:r>
+              <w:rPr>
+                <w:b w:val="false"/>
+                <w:bCs w:val="false"/>
+                <w:sz w:val="20"/>
+                <w:szCs w:val="20"/>
+              </w:rPr>
+              <w:t xml:space="preserve">Autobuze și mentenanță</w:t>
+            </w:r>
+          </w:p>
+        </w:tc>
+        <w:tc>
+          <w:tcPr>
+            <w:tcW w:type="dxa" w:w="6638"/>
+            <w:tcMar>
+              <w:top w:type="dxa" w:w="60"/>
+              <w:left w:type="dxa" w:w="110"/>
+              <w:bottom w:type="dxa" w:w="60"/>
+              <w:right w:type="dxa" w:w="110"/>
+            </w:tcMar>
+          </w:tcPr>
+          <w:p>
+            <w:r>
+              <w:rPr>
+                <w:b w:val="false"/>
+                <w:bCs w:val="false"/>
+                <w:sz w:val="20"/>
+                <w:szCs w:val="20"/>
+              </w:rPr>
+              <w:t xml:space="preserve">autobuzele cu structura locurilor pe file server, lucrările de mentenanță, ITP-ul și alertele de expirare</w:t>
+            </w:r>
+          </w:p>
+        </w:tc>
+      </w:tr>
+      <w:tr>
+        <w:tc>
+          <w:tcPr>
+            <w:tcW w:type="dxa" w:w="3000"/>
+            <w:tcMar>
+              <w:top w:type="dxa" w:w="60"/>
+              <w:left w:type="dxa" w:w="110"/>
+              <w:bottom w:type="dxa" w:w="60"/>
+              <w:right w:type="dxa" w:w="110"/>
+            </w:tcMar>
+          </w:tcPr>
+          <w:p>
+            <w:r>
+              <w:rPr>
+                <w:b w:val="false"/>
+                <w:bCs w:val="false"/>
+                <w:sz w:val="20"/>
+                <w:szCs w:val="20"/>
+              </w:rPr>
+              <w:t xml:space="preserve">Șoferi și reduceri</w:t>
+            </w:r>
+          </w:p>
+        </w:tc>
+        <w:tc>
+          <w:tcPr>
+            <w:tcW w:type="dxa" w:w="6638"/>
+            <w:tcMar>
+              <w:top w:type="dxa" w:w="60"/>
+              <w:left w:type="dxa" w:w="110"/>
+              <w:bottom w:type="dxa" w:w="60"/>
+              <w:right w:type="dxa" w:w="110"/>
+            </w:tcMar>
+          </w:tcPr>
+          <w:p>
+            <w:r>
+              <w:rPr>
+                <w:b w:val="false"/>
+                <w:bCs w:val="false"/>
+                <w:sz w:val="20"/>
+                <w:szCs w:val="20"/>
+              </w:rPr>
+              <w:t xml:space="preserve">gestionarea șoferilor și a tipurilor de reducere</w:t>
+            </w:r>
+          </w:p>
+        </w:tc>
+      </w:tr>
+      <w:tr>
+        <w:tc>
+          <w:tcPr>
+            <w:tcW w:type="dxa" w:w="3000"/>
+            <w:tcMar>
+              <w:top w:type="dxa" w:w="60"/>
+              <w:left w:type="dxa" w:w="110"/>
+              <w:bottom w:type="dxa" w:w="60"/>
+              <w:right w:type="dxa" w:w="110"/>
+            </w:tcMar>
+          </w:tcPr>
+          <w:p>
+            <w:r>
+              <w:rPr>
+                <w:b w:val="false"/>
+                <w:bCs w:val="false"/>
+                <w:sz w:val="20"/>
+                <w:szCs w:val="20"/>
+              </w:rPr>
+              <w:t xml:space="preserve">Curse</w:t>
+            </w:r>
+          </w:p>
+        </w:tc>
+        <w:tc>
+          <w:tcPr>
+            <w:tcW w:type="dxa" w:w="6638"/>
+            <w:tcMar>
+              <w:top w:type="dxa" w:w="60"/>
+              <w:left w:type="dxa" w:w="110"/>
+              <w:bottom w:type="dxa" w:w="60"/>
+              <w:right w:type="dxa" w:w="110"/>
+            </w:tcMar>
+          </w:tcPr>
+          <w:p>
+            <w:r>
+              <w:rPr>
+                <w:b w:val="false"/>
+                <w:bCs w:val="false"/>
+                <w:sz w:val="20"/>
+                <w:szCs w:val="20"/>
+              </w:rPr>
+              <w:t xml:space="preserve">căutarea după stații și dată, crearea cu verificarea autobuzului, șoferului și ITP-ului, statusurile, anularea cu rambursare</w:t>
+            </w:r>
+          </w:p>
+        </w:tc>
+      </w:tr>
+      <w:tr>
+        <w:tc>
+          <w:tcPr>
+            <w:tcW w:type="dxa" w:w="3000"/>
+            <w:tcMar>
+              <w:top w:type="dxa" w:w="60"/>
+              <w:left w:type="dxa" w:w="110"/>
+              <w:bottom w:type="dxa" w:w="60"/>
+              <w:right w:type="dxa" w:w="110"/>
+            </w:tcMar>
+          </w:tcPr>
+          <w:p>
+            <w:r>
+              <w:rPr>
+                <w:b w:val="false"/>
+                <w:bCs w:val="false"/>
+                <w:sz w:val="20"/>
+                <w:szCs w:val="20"/>
+              </w:rPr>
+              <w:t xml:space="preserve">Rezervări și bilete</w:t>
+            </w:r>
+          </w:p>
+        </w:tc>
+        <w:tc>
+          <w:tcPr>
+            <w:tcW w:type="dxa" w:w="6638"/>
+            <w:tcMar>
+              <w:top w:type="dxa" w:w="60"/>
+              <w:left w:type="dxa" w:w="110"/>
+              <w:bottom w:type="dxa" w:w="60"/>
+              <w:right w:type="dxa" w:w="110"/>
+            </w:tcMar>
+          </w:tcPr>
+          <w:p>
+            <w:r>
+              <w:rPr>
+                <w:b w:val="false"/>
+                <w:bCs w:val="false"/>
+                <w:sz w:val="20"/>
+                <w:szCs w:val="20"/>
+              </w:rPr>
+              <w:t xml:space="preserve">rezervarea provizorie, vânzarea, vânzarea rapidă, estimarea și efectuarea anulării, căutarea după cod</w:t>
+            </w:r>
+          </w:p>
+        </w:tc>
+      </w:tr>
+      <w:tr>
+        <w:tc>
+          <w:tcPr>
+            <w:tcW w:type="dxa" w:w="3000"/>
+            <w:tcMar>
+              <w:top w:type="dxa" w:w="60"/>
+              <w:left w:type="dxa" w:w="110"/>
+              <w:bottom w:type="dxa" w:w="60"/>
+              <w:right w:type="dxa" w:w="110"/>
+            </w:tcMar>
+          </w:tcPr>
+          <w:p>
+            <w:r>
+              <w:rPr>
+                <w:b w:val="false"/>
+                <w:bCs w:val="false"/>
+                <w:sz w:val="20"/>
+                <w:szCs w:val="20"/>
+              </w:rPr>
+              <w:t xml:space="preserve">Rapoarte și dashboard</w:t>
+            </w:r>
+          </w:p>
+        </w:tc>
+        <w:tc>
+          <w:tcPr>
+            <w:tcW w:type="dxa" w:w="6638"/>
+            <w:tcMar>
+              <w:top w:type="dxa" w:w="60"/>
+              <w:left w:type="dxa" w:w="110"/>
+              <w:bottom w:type="dxa" w:w="60"/>
+              <w:right w:type="dxa" w:w="110"/>
+            </w:tcMar>
+          </w:tcPr>
+          <w:p>
+            <w:r>
+              <w:rPr>
+                <w:b w:val="false"/>
+                <w:bCs w:val="false"/>
+                <w:sz w:val="20"/>
+                <w:szCs w:val="20"/>
+              </w:rPr>
+              <w:t xml:space="preserve">vânzări zilnice, ocupare, rapoarte comparative, export CSV și arhivare pe file server; cifrele zilei curente</w:t>
+            </w:r>
+          </w:p>
+        </w:tc>
+      </w:tr>
+      <w:tr>
+        <w:tc>
+          <w:tcPr>
+            <w:tcW w:type="dxa" w:w="3000"/>
+            <w:tcMar>
+              <w:top w:type="dxa" w:w="60"/>
+              <w:left w:type="dxa" w:w="110"/>
+              <w:bottom w:type="dxa" w:w="60"/>
+              <w:right w:type="dxa" w:w="110"/>
+            </w:tcMar>
+          </w:tcPr>
+          <w:p>
+            <w:r>
+              <w:rPr>
+                <w:b w:val="false"/>
+                <w:bCs w:val="false"/>
+                <w:sz w:val="20"/>
+                <w:szCs w:val="20"/>
+              </w:rPr>
+              <w:t xml:space="preserve">Conexiune și actualizări</w:t>
+            </w:r>
+          </w:p>
+        </w:tc>
+        <w:tc>
+          <w:tcPr>
+            <w:tcW w:type="dxa" w:w="6638"/>
+            <w:tcMar>
+              <w:top w:type="dxa" w:w="60"/>
+              <w:left w:type="dxa" w:w="110"/>
+              <w:bottom w:type="dxa" w:w="60"/>
+              <w:right w:type="dxa" w:w="110"/>
+            </w:tcMar>
+          </w:tcPr>
+          <w:p>
+            <w:r>
+              <w:rPr>
+                <w:b w:val="false"/>
+                <w:bCs w:val="false"/>
+                <w:sz w:val="20"/>
+                <w:szCs w:val="20"/>
+              </w:rPr>
+              <w:t xml:space="preserve">verificarea periodică a serverului SQL și a file server-ului; verificarea unei versiuni noi a aplicației</w:t>
+            </w:r>
+          </w:p>
+        </w:tc>
+      </w:tr>
+    </w:tbl>
+    <w:p>
+      <w:pPr>
+        <w:spacing w:after="60"/>
+      </w:pPr>
+    </w:p>
+    <w:p>
+      <w:pPr>
+        <w:pStyle w:val="Heading2"/>
+        <w:spacing w:after="100" w:before="220"/>
+      </w:pPr>
+      <w:r>
+        <w:t xml:space="preserve">Securitatea în aplicație</w:t>
+      </w:r>
+    </w:p>
+    <w:p>
+      <w:pPr>
+        <w:pStyle w:val="ListParagraph"/>
+        <w:numPr>
+          <w:ilvl w:val="0"/>
+          <w:numId w:val="2"/>
+        </w:numPr>
+        <w:spacing w:after="60"/>
+      </w:pPr>
+      <w:r>
+        <w:t xml:space="preserve">după 5 încercări de autentificare greșite în 15 minute, contul se blochează temporar; încercările se numără în jurnalul de audit, deci limita este aceeași pe toate stațiile;</w:t>
+      </w:r>
+    </w:p>
+    <w:p>
+      <w:pPr>
+        <w:pStyle w:val="ListParagraph"/>
+        <w:numPr>
+          <w:ilvl w:val="0"/>
+          <w:numId w:val="2"/>
+        </w:numPr>
+        <w:spacing w:after="60"/>
+      </w:pPr>
+      <w:r>
+        <w:t xml:space="preserve">recuperarea parolei: cererea din ecranul de login ajunge la administratori, care generează o parolă temporară; răspunsul nu dezvăluie dacă un cont există;</w:t>
+      </w:r>
+    </w:p>
+    <w:p>
+      <w:pPr>
+        <w:pStyle w:val="ListParagraph"/>
+        <w:numPr>
+          <w:ilvl w:val="0"/>
+          <w:numId w:val="2"/>
+        </w:numPr>
+        <w:spacing w:after="60"/>
+      </w:pPr>
+      <w:r>
+        <w:t xml:space="preserve">datele de conectare la SQL și la file server se păstrează pe fiecare stație într-un fișier de configurare, cu parolele criptate prin DPAPI (Windows);</w:t>
+      </w:r>
+    </w:p>
+    <w:p>
+      <w:pPr>
+        <w:pStyle w:val="ListParagraph"/>
+        <w:numPr>
+          <w:ilvl w:val="0"/>
+          <w:numId w:val="2"/>
+        </w:numPr>
+        <w:spacing w:after="60"/>
+      </w:pPr>
+      <w:r>
+        <w:t xml:space="preserve">operațiile importante — vânzări, anulări, modificări de date, autentificări — se înregistrează în jurnalul de audit;</w:t>
+      </w:r>
+    </w:p>
+    <w:p>
+      <w:pPr>
+        <w:pStyle w:val="ListParagraph"/>
+        <w:numPr>
+          <w:ilvl w:val="0"/>
+          <w:numId w:val="2"/>
+        </w:numPr>
+        <w:spacing w:after="60"/>
+      </w:pPr>
+      <w:r>
+        <w:t xml:space="preserve">erorile se scriu într-un jurnal local pe fiecare stație, păstrat 30 de zile.</w:t>
+      </w:r>
+    </w:p>
+    <w:p>
+      <w:pPr>
+        <w:spacing w:after="60"/>
+      </w:pPr>
+    </w:p>
+    <w:p>
+      <w:pPr>
+        <w:pStyle w:val="Heading2"/>
+        <w:spacing w:after="100" w:before="220"/>
+      </w:pPr>
+      <w:r>
+        <w:t xml:space="preserve">Modul offline</w:t>
+      </w:r>
+    </w:p>
+    <w:p>
+      <w:pPr>
+        <w:spacing w:after="120"/>
+      </w:pPr>
+      <w:r>
+        <w:t xml:space="preserve">Ultimele date citite cu succes (curse active, stații, reduceri, hartă, structurile autobuzelor) se păstrează local. Dacă serverul nu răspunde, aplicația le afișează pe acestea, iar la revenirea conexiunii le reîmprospătează automat. Vânzarea, rezervarea și anularea cer întotdeauna conexiune la baza de date, ca un loc să nu poată fi vândut de două ori.</w:t>
+      </w:r>
+    </w:p>
+    <w:p>
+      <w:pPr>
         <w:pStyle w:val="Heading1"/>
+        <w:keepNext/>
         <w:spacing w:after="140" w:before="320"/>
       </w:pPr>
       <w:r>
@@ -3741,6 +4460,328 @@
           </w:p>
         </w:tc>
       </w:tr>
+      <w:tr>
+        <w:tc>
+          <w:tcPr>
+            <w:tcW w:type="dxa" w:w="3200"/>
+            <w:tcMar>
+              <w:top w:type="dxa" w:w="60"/>
+              <w:left w:type="dxa" w:w="110"/>
+              <w:bottom w:type="dxa" w:w="60"/>
+              <w:right w:type="dxa" w:w="110"/>
+            </w:tcMar>
+          </w:tcPr>
+          <w:p>
+            <w:r>
+              <w:rPr>
+                <w:b w:val="false"/>
+                <w:bCs w:val="false"/>
+                <w:sz w:val="20"/>
+                <w:szCs w:val="20"/>
+              </w:rPr>
+              <w:t xml:space="preserve">Entity Framework Core pentru citiri, proceduri stocate pentru operațiile critice</w:t>
+            </w:r>
+          </w:p>
+        </w:tc>
+        <w:tc>
+          <w:tcPr>
+            <w:tcW w:type="dxa" w:w="6438"/>
+            <w:tcMar>
+              <w:top w:type="dxa" w:w="60"/>
+              <w:left w:type="dxa" w:w="110"/>
+              <w:bottom w:type="dxa" w:w="60"/>
+              <w:right w:type="dxa" w:w="110"/>
+            </w:tcMar>
+          </w:tcPr>
+          <w:p>
+            <w:r>
+              <w:rPr>
+                <w:b w:val="false"/>
+                <w:bCs w:val="false"/>
+                <w:sz w:val="20"/>
+                <w:szCs w:val="20"/>
+              </w:rPr>
+              <w:t xml:space="preserve">interogări simple din cod, fără a dubla logica tranzacțională</w:t>
+            </w:r>
+          </w:p>
+        </w:tc>
+      </w:tr>
+      <w:tr>
+        <w:tc>
+          <w:tcPr>
+            <w:tcW w:type="dxa" w:w="3200"/>
+            <w:tcMar>
+              <w:top w:type="dxa" w:w="60"/>
+              <w:left w:type="dxa" w:w="110"/>
+              <w:bottom w:type="dxa" w:w="60"/>
+              <w:right w:type="dxa" w:w="110"/>
+            </w:tcMar>
+          </w:tcPr>
+          <w:p>
+            <w:r>
+              <w:rPr>
+                <w:b w:val="false"/>
+                <w:bCs w:val="false"/>
+                <w:sz w:val="20"/>
+                <w:szCs w:val="20"/>
+              </w:rPr>
+              <w:t xml:space="preserve">Parole cu PBKDF2-SHA256</w:t>
+            </w:r>
+          </w:p>
+        </w:tc>
+        <w:tc>
+          <w:tcPr>
+            <w:tcW w:type="dxa" w:w="6438"/>
+            <w:tcMar>
+              <w:top w:type="dxa" w:w="60"/>
+              <w:left w:type="dxa" w:w="110"/>
+              <w:bottom w:type="dxa" w:w="60"/>
+              <w:right w:type="dxa" w:w="110"/>
+            </w:tcMar>
+          </w:tcPr>
+          <w:p>
+            <w:r>
+              <w:rPr>
+                <w:b w:val="false"/>
+                <w:bCs w:val="false"/>
+                <w:sz w:val="20"/>
+                <w:szCs w:val="20"/>
+              </w:rPr>
+              <w:t xml:space="preserve">hash lent, cu sare; conturile din datele de test se convertesc automat</w:t>
+            </w:r>
+          </w:p>
+        </w:tc>
+      </w:tr>
+      <w:tr>
+        <w:tc>
+          <w:tcPr>
+            <w:tcW w:type="dxa" w:w="3200"/>
+            <w:tcMar>
+              <w:top w:type="dxa" w:w="60"/>
+              <w:left w:type="dxa" w:w="110"/>
+              <w:bottom w:type="dxa" w:w="60"/>
+              <w:right w:type="dxa" w:w="110"/>
+            </w:tcMar>
+          </w:tcPr>
+          <w:p>
+            <w:r>
+              <w:rPr>
+                <w:b w:val="false"/>
+                <w:bCs w:val="false"/>
+                <w:sz w:val="20"/>
+                <w:szCs w:val="20"/>
+              </w:rPr>
+              <w:t xml:space="preserve">Încercările de login numărate în jurnalul de audit</w:t>
+            </w:r>
+          </w:p>
+        </w:tc>
+        <w:tc>
+          <w:tcPr>
+            <w:tcW w:type="dxa" w:w="6438"/>
+            <w:tcMar>
+              <w:top w:type="dxa" w:w="60"/>
+              <w:left w:type="dxa" w:w="110"/>
+              <w:bottom w:type="dxa" w:w="60"/>
+              <w:right w:type="dxa" w:w="110"/>
+            </w:tcMar>
+          </w:tcPr>
+          <w:p>
+            <w:r>
+              <w:rPr>
+                <w:b w:val="false"/>
+                <w:bCs w:val="false"/>
+                <w:sz w:val="20"/>
+                <w:szCs w:val="20"/>
+              </w:rPr>
+              <w:t xml:space="preserve">limita e comună tuturor stațiilor, fără tabel nou</w:t>
+            </w:r>
+          </w:p>
+        </w:tc>
+      </w:tr>
+      <w:tr>
+        <w:tc>
+          <w:tcPr>
+            <w:tcW w:type="dxa" w:w="3200"/>
+            <w:tcMar>
+              <w:top w:type="dxa" w:w="60"/>
+              <w:left w:type="dxa" w:w="110"/>
+              <w:bottom w:type="dxa" w:w="60"/>
+              <w:right w:type="dxa" w:w="110"/>
+            </w:tcMar>
+          </w:tcPr>
+          <w:p>
+            <w:r>
+              <w:rPr>
+                <w:b w:val="false"/>
+                <w:bCs w:val="false"/>
+                <w:sz w:val="20"/>
+                <w:szCs w:val="20"/>
+              </w:rPr>
+              <w:t xml:space="preserve">Resetarea parolei prin administrator</w:t>
+            </w:r>
+          </w:p>
+        </w:tc>
+        <w:tc>
+          <w:tcPr>
+            <w:tcW w:type="dxa" w:w="6438"/>
+            <w:tcMar>
+              <w:top w:type="dxa" w:w="60"/>
+              <w:left w:type="dxa" w:w="110"/>
+              <w:bottom w:type="dxa" w:w="60"/>
+              <w:right w:type="dxa" w:w="110"/>
+            </w:tcMar>
+          </w:tcPr>
+          <w:p>
+            <w:r>
+              <w:rPr>
+                <w:b w:val="false"/>
+                <w:bCs w:val="false"/>
+                <w:sz w:val="20"/>
+                <w:szCs w:val="20"/>
+              </w:rPr>
+              <w:t xml:space="preserve">nu există serviciu de email; cererea rămâne înregistrată</w:t>
+            </w:r>
+          </w:p>
+        </w:tc>
+      </w:tr>
+      <w:tr>
+        <w:tc>
+          <w:tcPr>
+            <w:tcW w:type="dxa" w:w="3200"/>
+            <w:tcMar>
+              <w:top w:type="dxa" w:w="60"/>
+              <w:left w:type="dxa" w:w="110"/>
+              <w:bottom w:type="dxa" w:w="60"/>
+              <w:right w:type="dxa" w:w="110"/>
+            </w:tcMar>
+          </w:tcPr>
+          <w:p>
+            <w:r>
+              <w:rPr>
+                <w:b w:val="false"/>
+                <w:bCs w:val="false"/>
+                <w:sz w:val="20"/>
+                <w:szCs w:val="20"/>
+              </w:rPr>
+              <w:t xml:space="preserve">Parolele de conectare criptate DPAPI</w:t>
+            </w:r>
+          </w:p>
+        </w:tc>
+        <w:tc>
+          <w:tcPr>
+            <w:tcW w:type="dxa" w:w="6438"/>
+            <w:tcMar>
+              <w:top w:type="dxa" w:w="60"/>
+              <w:left w:type="dxa" w:w="110"/>
+              <w:bottom w:type="dxa" w:w="60"/>
+              <w:right w:type="dxa" w:w="110"/>
+            </w:tcMar>
+          </w:tcPr>
+          <w:p>
+            <w:r>
+              <w:rPr>
+                <w:b w:val="false"/>
+                <w:bCs w:val="false"/>
+                <w:sz w:val="20"/>
+                <w:szCs w:val="20"/>
+              </w:rPr>
+              <w:t xml:space="preserve">fișierul de configurare al stației nu conține parole în clar</w:t>
+            </w:r>
+          </w:p>
+        </w:tc>
+      </w:tr>
+      <w:tr>
+        <w:tc>
+          <w:tcPr>
+            <w:tcW w:type="dxa" w:w="3200"/>
+            <w:tcMar>
+              <w:top w:type="dxa" w:w="60"/>
+              <w:left w:type="dxa" w:w="110"/>
+              <w:bottom w:type="dxa" w:w="60"/>
+              <w:right w:type="dxa" w:w="110"/>
+            </w:tcMar>
+          </w:tcPr>
+          <w:p>
+            <w:r>
+              <w:rPr>
+                <w:b w:val="false"/>
+                <w:bCs w:val="false"/>
+                <w:sz w:val="20"/>
+                <w:szCs w:val="20"/>
+              </w:rPr>
+              <w:t xml:space="preserve">Modul offline doar pentru citire</w:t>
+            </w:r>
+          </w:p>
+        </w:tc>
+        <w:tc>
+          <w:tcPr>
+            <w:tcW w:type="dxa" w:w="6438"/>
+            <w:tcMar>
+              <w:top w:type="dxa" w:w="60"/>
+              <w:left w:type="dxa" w:w="110"/>
+              <w:bottom w:type="dxa" w:w="60"/>
+              <w:right w:type="dxa" w:w="110"/>
+            </w:tcMar>
+          </w:tcPr>
+          <w:p>
+            <w:r>
+              <w:rPr>
+                <w:b w:val="false"/>
+                <w:bCs w:val="false"/>
+                <w:sz w:val="20"/>
+                <w:szCs w:val="20"/>
+              </w:rPr>
+              <w:t xml:space="preserve">o vânzare fără server ar putea ocupa un loc deja vândut</w:t>
+            </w:r>
+          </w:p>
+        </w:tc>
+      </w:tr>
+      <w:tr>
+        <w:tc>
+          <w:tcPr>
+            <w:tcW w:type="dxa" w:w="3200"/>
+            <w:tcMar>
+              <w:top w:type="dxa" w:w="60"/>
+              <w:left w:type="dxa" w:w="110"/>
+              <w:bottom w:type="dxa" w:w="60"/>
+              <w:right w:type="dxa" w:w="110"/>
+            </w:tcMar>
+          </w:tcPr>
+          <w:p>
+            <w:r>
+              <w:rPr>
+                <w:b w:val="false"/>
+                <w:bCs w:val="false"/>
+                <w:sz w:val="20"/>
+                <w:szCs w:val="20"/>
+              </w:rPr>
+              <w:t xml:space="preserve">Rapoarte exportate CSV</w:t>
+            </w:r>
+          </w:p>
+        </w:tc>
+        <w:tc>
+          <w:tcPr>
+            <w:tcW w:type="dxa" w:w="6438"/>
+            <w:tcMar>
+              <w:top w:type="dxa" w:w="60"/>
+              <w:left w:type="dxa" w:w="110"/>
+              <w:bottom w:type="dxa" w:w="60"/>
+              <w:right w:type="dxa" w:w="110"/>
+            </w:tcMar>
+          </w:tcPr>
+          <w:p>
+            <w:r>
+              <w:rPr>
+                <w:b w:val="false"/>
+                <w:bCs w:val="false"/>
+                <w:sz w:val="20"/>
+                <w:szCs w:val="20"/>
+              </w:rPr>
+              <w:t xml:space="preserve">se deschid direct în Excel, fără bibliotecă suplimentară</w:t>
+            </w:r>
+          </w:p>
+        </w:tc>
+      </w:tr>
     </w:tbl>
     <w:p>
       <w:pPr>
@@ -3997,7 +5038,7 @@
                 <w:sz w:val="20"/>
                 <w:szCs w:val="20"/>
               </w:rPr>
-              <w:t xml:space="preserve">prezentarea proiectului și structura repository-ului</w:t>
+              <w:t xml:space="preserve">prezentarea proiectului, structura repository-ului și folosirea backend-ului</w:t>
             </w:r>
           </w:p>
         </w:tc>
@@ -4090,6 +5131,52 @@
                 <w:szCs w:val="20"/>
               </w:rPr>
               <w:t xml:space="preserve">fișierele JSON: autobuzele și harta stațiilor</w:t>
+            </w:r>
+          </w:p>
+        </w:tc>
+      </w:tr>
+      <w:tr>
+        <w:tc>
+          <w:tcPr>
+            <w:tcW w:type="dxa" w:w="3000"/>
+            <w:tcMar>
+              <w:top w:type="dxa" w:w="60"/>
+              <w:left w:type="dxa" w:w="110"/>
+              <w:bottom w:type="dxa" w:w="60"/>
+              <w:right w:type="dxa" w:w="110"/>
+            </w:tcMar>
+          </w:tcPr>
+          <w:p>
+            <w:r>
+              <w:rPr>
+                <w:b w:val="false"/>
+                <w:bCs w:val="false"/>
+                <w:sz w:val="20"/>
+                <w:szCs w:val="20"/>
+              </w:rPr>
+              <w:t xml:space="preserve">App</w:t>
+            </w:r>
+          </w:p>
+        </w:tc>
+        <w:tc>
+          <w:tcPr>
+            <w:tcW w:type="dxa" w:w="6638"/>
+            <w:tcMar>
+              <w:top w:type="dxa" w:w="60"/>
+              <w:left w:type="dxa" w:w="110"/>
+              <w:bottom w:type="dxa" w:w="60"/>
+              <w:right w:type="dxa" w:w="110"/>
+            </w:tcMar>
+          </w:tcPr>
+          <w:p>
+            <w:r>
+              <w:rPr>
+                <w:b w:val="false"/>
+                <w:bCs w:val="false"/>
+                <w:sz w:val="20"/>
+                <w:szCs w:val="20"/>
+              </w:rPr>
+              <w:t xml:space="preserve">soluția .NET cu proiectele de backend</w:t>
             </w:r>
           </w:p>
         </w:tc>

</xml_diff>